<commit_message>
Update O1A Criterion 3 technical exhibit with analytics-architecture evidence
Add a section showing the applicant independently re-applied the ICCS
paper's deterministic-core/bounded-stochastic-layer methodology to a
second, unrelated system (VideoText.io's canonical analytics architecture,
validated with zero unexplained field-level discrepancies), plus the
measured ~47x-realtime production transcription benchmark. Keeps
point-in-time business figures out of the exhibit by design so it doesn't
need continual updating; regenerates the .docx from the updated script.
</commit_message>
<xml_diff>
--- a/docs/O1A/RESEARCH_TO_PRODUCT_CRITERION3_TECHNICAL_SUMMARY.docx
+++ b/docs/O1A/RESEARCH_TO_PRODUCT_CRITERION3_TECHNICAL_SUMMARY.docx
@@ -227,7 +227,12 @@
     </w:p>
     <w:p>
       <w:r>
-        <w:t>VideoText.io is a commercial deployment of the same architectural discipline in a different domain (professional video and timed text). The product’s backbone is an explicit upload → validate → queue → worker → download pipeline with tier-aware orchestration. Deterministic, non-LLM stages (FFmpeg-based media transforms, deterministic transcript normalization, structured exports keyed off fixed segments, deterministic cache keys) bound the repeatable, customer-facing artifacts. Optional LLM features (for example, transcript summary, chapter titling from timestamped segments) are computed only after the primary timed transcript exists and are stored and delivered as separate fields, so they do not redefine the core subtitle or transcript payload that customers treat as authoritative for editing, compliance-style review, or downstream automation. Purely rule-based product logic (for example, in-app guidance triggers) is implemented without AI, mirroring the paper’s emphasis on traceable, reproducible decision paths where human operators expect stability.</w:t>
+        <w:t>VideoText.io is a commercial deployment of the same architectural discipline in a different domain (professional video and timed text). The product’s backbone is an explicit upload → validate → queue → worker → download pipeline with tier-aware orchestration. Deterministic, non-LLM stages (FFmpeg-based media transforms, deterministic transcript normalization, structured exports keyed off fixed segments, deterministic cache keys) bound the repeatable, customer-facing artifacts. Optional LLM features (for example, transcript summary, chapter titling from timestamped segments) are computed only after the primary timed transcript exists and are stored and delivered as separate fields, so they do not redefine the core subtitle or transcript payload that customers treat as authoritative for editing, compliance-style review, or downstream automation. Purely rule-based product logic (for example, in-app guidance triggers) is implemented without AI, mirroring the paper’s emphasis on traceable, reproducible decision paths where human operators expect stability. On raw throughput, the same production pipeline processes long-form video at roughly 47× realtime on a representative nearly-two-hour file — a reproducible, code-instrumented benchmark (server-side timing logs, not a marketing estimate) that is competitive with or faster than single-node commercial transcription throughput reported elsewhere in the industry, evidence that the deterministic engineering discipline below did not come at the cost of production performance.</w:t>
+      </w:r>
+    </w:p>
+    <w:p>
+      <w:r>
+        <w:t>The applicant has independently applied the same discipline — a single deterministic source of truth, explicit boundaries around any judgment-dependent or probabilistic layer, and continuous automated reconciliation rather than one-time manual audit — to a second, unrelated system: VideoText.io’s internal business-analytics platform. That program defines a canonical, governed metric layer (one definition, one source, one code path per KPI), separates a deterministic system of record (Postgres/Stripe) from a probabilistic, explicitly-labeled layer (browser-based session analytics), and requires every reconciliation check to pass with zero unexplained discrepancies before a metric is allowed to go live. This is not the same artifact as the ICCS paper, but it is the same underlying engineering judgment restated in a second domain — evidence of a repeatable methodology rather than a single result.</w:t>
       </w:r>
     </w:p>
     <w:p>
@@ -669,6 +674,83 @@
           <w:rFonts w:ascii="Calibri" w:hAnsi="Calibri"/>
           <w:color w:val="000000"/>
         </w:rPr>
+        <w:t>A second, independent application of the same engineering discipline</w:t>
+      </w:r>
+    </w:p>
+    <w:p>
+      <w:r>
+        <w:t>Criterion 3 is strengthened when the same original methodology recurs in an independent setting, because that shows a transferable engineering judgment rather than a single publication-shaped result. VideoText.io provides that recurrence internally: separate from the media-processing pipeline mapped above, the applicant designed and is deploying a canonical business-analytics architecture governing how every product and revenue metric is defined, computed, and served.</w:t>
+      </w:r>
+    </w:p>
+    <w:p>
+      <w:r>
+        <w:rPr>
+          <w:rFonts w:ascii="Calibri" w:hAnsi="Calibri" w:eastAsia="Calibri"/>
+          <w:b/>
+          <w:i w:val="0"/>
+        </w:rPr>
+        <w:t xml:space="preserve">Same core pattern, different domain. </w:t>
+      </w:r>
+      <w:r>
+        <w:rPr>
+          <w:rFonts w:ascii="Calibri" w:hAnsi="Calibri" w:eastAsia="Calibri"/>
+          <w:b w:val="0"/>
+          <w:i w:val="0"/>
+        </w:rPr>
+        <w:t>The analytics architecture separates a single deterministic system of record (Postgres for identity and product usage, Stripe for money) from a probabilistic, explicitly-labeled layer (browser-based session analytics), and requires every metric to resolve to exactly one canonical definition, one source, and one code path — the same structural move as the paper’s separation of a deterministic execution boundary from a non-authoritative stochastic layer.</w:t>
+      </w:r>
+    </w:p>
+    <w:p>
+      <w:r>
+        <w:rPr>
+          <w:rFonts w:ascii="Calibri" w:hAnsi="Calibri" w:eastAsia="Calibri"/>
+          <w:b/>
+          <w:i w:val="0"/>
+        </w:rPr>
+        <w:t xml:space="preserve">Independently measured, not just designed. </w:t>
+      </w:r>
+      <w:r>
+        <w:rPr>
+          <w:rFonts w:ascii="Calibri" w:hAnsi="Calibri" w:eastAsia="Calibri"/>
+          <w:b w:val="0"/>
+          <w:i w:val="0"/>
+        </w:rPr>
+        <w:t>The canonical layer was validated field-by-field against the raw system of record before any dashboard was allowed to read from it, with every reconciled field passing with zero unexplained discrepancies — an empirical traceability check in the same spirit as the paper’s measured 100% traceability result, applied here to a live commercial system rather than a benchmark corpus.</w:t>
+      </w:r>
+    </w:p>
+    <w:p>
+      <w:r>
+        <w:rPr>
+          <w:rFonts w:ascii="Calibri" w:hAnsi="Calibri" w:eastAsia="Calibri"/>
+          <w:b/>
+          <w:i w:val="0"/>
+        </w:rPr>
+        <w:t xml:space="preserve">Governed, not one-time. </w:t>
+      </w:r>
+      <w:r>
+        <w:rPr>
+          <w:rFonts w:ascii="Calibri" w:hAnsi="Calibri" w:eastAsia="Calibri"/>
+          <w:b w:val="0"/>
+          <w:i w:val="0"/>
+        </w:rPr>
+        <w:t>New metrics require a documented definition, a declared source, an owner, and an automated validation rule before they ship, and any metric that depends on judgment (for example, model-derived lifetime value or cost-allocation-dependent margin) is explicitly labeled at reduced confidence rather than presented with false precision — the same intellectual honesty about the boundary of deterministic guarantees that the paper itself insists on.</w:t>
+      </w:r>
+    </w:p>
+    <w:p>
+      <w:r>
+        <w:t>For adjudication purposes, this second application is offered as corroborating evidence of originality and consistent engineering judgment, not as a second scholarly contribution. It shows the applicant applying the peer-reviewed framework’s central idea — a governed deterministic core with clearly bounded, non-authoritative probabilistic layers — a second time, on a different system, at his own initiative, in production.</w:t>
+      </w:r>
+    </w:p>
+    <w:p>
+      <w:pPr>
+        <w:pStyle w:val="Heading1"/>
+        <w:spacing w:before="240" w:after="120"/>
+      </w:pPr>
+      <w:r>
+        <w:rPr>
+          <w:rFonts w:ascii="Calibri" w:hAnsi="Calibri"/>
+          <w:color w:val="000000"/>
+        </w:rPr>
         <w:t>Why this supports “major significance” under Criterion 3</w:t>
       </w:r>
     </w:p>
@@ -691,7 +773,7 @@
         <w:t xml:space="preserve">2. Significance (industry). </w:t>
       </w:r>
       <w:r>
-        <w:t>VideoText.io converts that research mindset into shipping software with subscriptions and usage metering, proving the applicant can operationalize hybrid AI systems beyond a lab benchmark — a relatively rare combination in O-1A filings that often show either publications or a product, not a coherent bridge between the two. Independent distribution and review channels reinforce field recognition: the product is featured on IndieHunt, carries a Fazier badge or listing, and is published on G2 and Capterra, which are widely used by buyers to evaluate software — evidence that the contribution sits in the commercial marketplace, not only in a private deployment.</w:t>
+        <w:t>VideoText.io converts that research mindset into shipping software with subscriptions and usage metering, proving the applicant can operationalize hybrid AI systems beyond a lab benchmark — a relatively rare combination in O-1A filings that often show either publications or a product, not a coherent bridge between the two. That the applicant then independently re-applied the same governed-determinism methodology to a second, unrelated system (the analytics architecture described above) — reaching a measured zero-unexplained-discrepancy reconciliation result without being asked to — indicates a repeatable engineering judgment rather than a one-off result, and the production pipeline’s own throughput (approximately 47× realtime on long-form video, measured, not estimated) shows the discipline was applied without sacrificing commercial performance. Independent distribution and review channels reinforce field recognition: the product is featured on IndieHunt, carries a Fazier badge or listing, and is published on G2 and Capterra, which are widely used by buyers to evaluate software — evidence that the contribution sits in the commercial marketplace, not only in a private deployment.</w:t>
       </w:r>
     </w:p>
     <w:p>
@@ -2664,7 +2746,7 @@
           <w:i/>
           <w:sz w:val="20"/>
         </w:rPr>
-        <w:t>Prepared as a technical exhibit for immigration counsel. Attach the camera-ready ICCS PDF to the petition as the primary scholarly exhibit. Add redacted revenue, customer counts, or testimonials only as separate exhibits if counsel approves.</w:t>
+        <w:t>Prepared as a technical exhibit for immigration counsel; last regenerated 2026-08-08. Attach the camera-ready ICCS PDF to the petition as the primary scholarly exhibit. Add redacted revenue, customer counts, subscriber counts, and testimonials only as separate exhibits if counsel approves — this memorandum intentionally states production evidence qualitatively (measured reconciliation results, measured throughput) rather than citing point-in-time headcounts that would need continual updating and are better sourced fresh from Stripe/Postgres at filing time.</w:t>
       </w:r>
     </w:p>
     <w:sectPr>

</xml_diff>

<commit_message>
Add current production snapshot with real dashboard metrics to O1A exhibit
Replace the earlier qualitative-only approach with a dated table of
operational/quality metrics (489 users, 201 signups/+67% WoW, ~1,480
jobs/30d, 24.5s avg / 116.5s p95 processing, 5.1% failure rate, 4.6/5
rating from 38 reviews) sourced from the internal ops dashboard.
Deliberately excludes revenue/subscriber-count figures as commercially
sensitive and better handled as a separate counsel-approved exhibit.
</commit_message>
<xml_diff>
--- a/docs/O1A/RESEARCH_TO_PRODUCT_CRITERION3_TECHNICAL_SUMMARY.docx
+++ b/docs/O1A/RESEARCH_TO_PRODUCT_CRITERION3_TECHNICAL_SUMMARY.docx
@@ -205,6 +205,559 @@
           <w:sz w:val="20"/>
         </w:rPr>
         <w:t>Immigration packet: include direct links to each listing and/or dated PDF screenshots as labeled exhibits (e.g., Exhibit C-3a through C-3d).</w:t>
+      </w:r>
+    </w:p>
+    <w:p>
+      <w:pPr>
+        <w:pStyle w:val="Heading2"/>
+        <w:spacing w:before="200" w:after="120"/>
+      </w:pPr>
+      <w:r>
+        <w:rPr>
+          <w:rFonts w:ascii="Calibri" w:hAnsi="Calibri"/>
+          <w:color w:val="000000"/>
+        </w:rPr>
+        <w:t>Current production snapshot (field-level significance)</w:t>
+      </w:r>
+    </w:p>
+    <w:p>
+      <w:r>
+        <w:t>The following figures are drawn directly from VideoText.io’s internal operations dashboard (sourced from the canonical Postgres business_users / business_jobs views described in the analytics-architecture section below) as of 2026-08-08. They are offered as direct evidence that the applicant’s engineering choices — deterministic, non-LLM stages for the core pipeline; explicit tier-aware orchestration; result caching — translate into fast, reliable, well-received service under real usage, not only theoretical design.</w:t>
+      </w:r>
+    </w:p>
+    <w:tbl>
+      <w:tblPr>
+        <w:tblStyle w:val="TableGrid"/>
+        <w:tblW w:type="auto" w:w="0"/>
+        <w:jc w:val="center"/>
+        <w:tblLook w:firstColumn="1" w:firstRow="1" w:lastColumn="0" w:lastRow="0" w:noHBand="0" w:noVBand="1" w:val="04A0"/>
+      </w:tblPr>
+      <w:tblGrid>
+        <w:gridCol w:w="2880"/>
+        <w:gridCol w:w="2880"/>
+        <w:gridCol w:w="2880"/>
+      </w:tblGrid>
+      <w:tr>
+        <w:tc>
+          <w:tcPr>
+            <w:tcW w:type="dxa" w:w="3312"/>
+            <w:shd w:fill="D9D9D9"/>
+          </w:tcPr>
+          <w:p>
+            <w:pPr>
+              <w:jc w:val="center"/>
+            </w:pPr>
+            <w:r/>
+            <w:r>
+              <w:rPr>
+                <w:rFonts w:ascii="Calibri" w:hAnsi="Calibri"/>
+                <w:b/>
+                <w:sz w:val="20"/>
+              </w:rPr>
+              <w:t>Metric</w:t>
+            </w:r>
+          </w:p>
+        </w:tc>
+        <w:tc>
+          <w:tcPr>
+            <w:tcW w:type="dxa" w:w="3312"/>
+            <w:shd w:fill="D9D9D9"/>
+          </w:tcPr>
+          <w:p>
+            <w:pPr>
+              <w:jc w:val="center"/>
+            </w:pPr>
+            <w:r/>
+            <w:r>
+              <w:rPr>
+                <w:rFonts w:ascii="Calibri" w:hAnsi="Calibri"/>
+                <w:b/>
+                <w:sz w:val="20"/>
+              </w:rPr>
+              <w:t>Value</w:t>
+            </w:r>
+          </w:p>
+        </w:tc>
+        <w:tc>
+          <w:tcPr>
+            <w:tcW w:type="dxa" w:w="2736"/>
+            <w:shd w:fill="D9D9D9"/>
+          </w:tcPr>
+          <w:p>
+            <w:pPr>
+              <w:jc w:val="center"/>
+            </w:pPr>
+            <w:r/>
+            <w:r>
+              <w:rPr>
+                <w:rFonts w:ascii="Calibri" w:hAnsi="Calibri"/>
+                <w:b/>
+                <w:sz w:val="20"/>
+              </w:rPr>
+              <w:t>Window</w:t>
+            </w:r>
+          </w:p>
+        </w:tc>
+      </w:tr>
+      <w:tr>
+        <w:tc>
+          <w:tcPr>
+            <w:tcW w:type="dxa" w:w="3312"/>
+          </w:tcPr>
+          <w:p>
+            <w:pPr>
+              <w:spacing w:after="60"/>
+            </w:pPr>
+            <w:r/>
+            <w:r>
+              <w:rPr>
+                <w:rFonts w:ascii="Calibri" w:hAnsi="Calibri"/>
+                <w:sz w:val="20"/>
+              </w:rPr>
+              <w:t>Registered users</w:t>
+            </w:r>
+          </w:p>
+        </w:tc>
+        <w:tc>
+          <w:tcPr>
+            <w:tcW w:type="dxa" w:w="3312"/>
+          </w:tcPr>
+          <w:p>
+            <w:pPr>
+              <w:spacing w:after="60"/>
+            </w:pPr>
+            <w:r/>
+            <w:r>
+              <w:rPr>
+                <w:rFonts w:ascii="Calibri" w:hAnsi="Calibri"/>
+                <w:sz w:val="20"/>
+              </w:rPr>
+              <w:t>489</w:t>
+            </w:r>
+          </w:p>
+        </w:tc>
+        <w:tc>
+          <w:tcPr>
+            <w:tcW w:type="dxa" w:w="2736"/>
+          </w:tcPr>
+          <w:p>
+            <w:pPr>
+              <w:spacing w:after="60"/>
+            </w:pPr>
+            <w:r/>
+            <w:r>
+              <w:rPr>
+                <w:rFonts w:ascii="Calibri" w:hAnsi="Calibri"/>
+                <w:sz w:val="20"/>
+              </w:rPr>
+              <w:t>cumulative, as of snapshot date</w:t>
+            </w:r>
+          </w:p>
+        </w:tc>
+      </w:tr>
+      <w:tr>
+        <w:tc>
+          <w:tcPr>
+            <w:tcW w:type="dxa" w:w="3312"/>
+          </w:tcPr>
+          <w:p>
+            <w:pPr>
+              <w:spacing w:after="60"/>
+            </w:pPr>
+            <w:r/>
+            <w:r>
+              <w:rPr>
+                <w:rFonts w:ascii="Calibri" w:hAnsi="Calibri"/>
+                <w:sz w:val="20"/>
+              </w:rPr>
+              <w:t>New signups</w:t>
+            </w:r>
+          </w:p>
+        </w:tc>
+        <w:tc>
+          <w:tcPr>
+            <w:tcW w:type="dxa" w:w="3312"/>
+          </w:tcPr>
+          <w:p>
+            <w:pPr>
+              <w:spacing w:after="60"/>
+            </w:pPr>
+            <w:r/>
+            <w:r>
+              <w:rPr>
+                <w:rFonts w:ascii="Calibri" w:hAnsi="Calibri"/>
+                <w:sz w:val="20"/>
+              </w:rPr>
+              <w:t>201 (+67% week-over-week)</w:t>
+            </w:r>
+          </w:p>
+        </w:tc>
+        <w:tc>
+          <w:tcPr>
+            <w:tcW w:type="dxa" w:w="2736"/>
+          </w:tcPr>
+          <w:p>
+            <w:pPr>
+              <w:spacing w:after="60"/>
+            </w:pPr>
+            <w:r/>
+            <w:r>
+              <w:rPr>
+                <w:rFonts w:ascii="Calibri" w:hAnsi="Calibri"/>
+                <w:sz w:val="20"/>
+              </w:rPr>
+              <w:t>trailing 30 days</w:t>
+            </w:r>
+          </w:p>
+        </w:tc>
+      </w:tr>
+      <w:tr>
+        <w:tc>
+          <w:tcPr>
+            <w:tcW w:type="dxa" w:w="3312"/>
+          </w:tcPr>
+          <w:p>
+            <w:pPr>
+              <w:spacing w:after="60"/>
+            </w:pPr>
+            <w:r/>
+            <w:r>
+              <w:rPr>
+                <w:rFonts w:ascii="Calibri" w:hAnsi="Calibri"/>
+                <w:sz w:val="20"/>
+              </w:rPr>
+              <w:t>Jobs completed across all tools</w:t>
+            </w:r>
+          </w:p>
+        </w:tc>
+        <w:tc>
+          <w:tcPr>
+            <w:tcW w:type="dxa" w:w="3312"/>
+          </w:tcPr>
+          <w:p>
+            <w:pPr>
+              <w:spacing w:after="60"/>
+            </w:pPr>
+            <w:r/>
+            <w:r>
+              <w:rPr>
+                <w:rFonts w:ascii="Calibri" w:hAnsi="Calibri"/>
+                <w:sz w:val="20"/>
+              </w:rPr>
+              <w:t>≈1,480</w:t>
+            </w:r>
+          </w:p>
+        </w:tc>
+        <w:tc>
+          <w:tcPr>
+            <w:tcW w:type="dxa" w:w="2736"/>
+          </w:tcPr>
+          <w:p>
+            <w:pPr>
+              <w:spacing w:after="60"/>
+            </w:pPr>
+            <w:r/>
+            <w:r>
+              <w:rPr>
+                <w:rFonts w:ascii="Calibri" w:hAnsi="Calibri"/>
+                <w:sz w:val="20"/>
+              </w:rPr>
+              <w:t>trailing 30 days</w:t>
+            </w:r>
+          </w:p>
+        </w:tc>
+      </w:tr>
+      <w:tr>
+        <w:tc>
+          <w:tcPr>
+            <w:tcW w:type="dxa" w:w="3312"/>
+          </w:tcPr>
+          <w:p>
+            <w:pPr>
+              <w:spacing w:after="60"/>
+            </w:pPr>
+            <w:r/>
+            <w:r>
+              <w:rPr>
+                <w:rFonts w:ascii="Calibri" w:hAnsi="Calibri"/>
+                <w:sz w:val="20"/>
+              </w:rPr>
+              <w:t>Average job processing time</w:t>
+            </w:r>
+          </w:p>
+        </w:tc>
+        <w:tc>
+          <w:tcPr>
+            <w:tcW w:type="dxa" w:w="3312"/>
+          </w:tcPr>
+          <w:p>
+            <w:pPr>
+              <w:spacing w:after="60"/>
+            </w:pPr>
+            <w:r/>
+            <w:r>
+              <w:rPr>
+                <w:rFonts w:ascii="Calibri" w:hAnsi="Calibri"/>
+                <w:sz w:val="20"/>
+              </w:rPr>
+              <w:t>24.5 s</w:t>
+            </w:r>
+          </w:p>
+        </w:tc>
+        <w:tc>
+          <w:tcPr>
+            <w:tcW w:type="dxa" w:w="2736"/>
+          </w:tcPr>
+          <w:p>
+            <w:pPr>
+              <w:spacing w:after="60"/>
+            </w:pPr>
+            <w:r/>
+            <w:r>
+              <w:rPr>
+                <w:rFonts w:ascii="Calibri" w:hAnsi="Calibri"/>
+                <w:sz w:val="20"/>
+              </w:rPr>
+              <w:t>trailing 30 days, completed jobs</w:t>
+            </w:r>
+          </w:p>
+        </w:tc>
+      </w:tr>
+      <w:tr>
+        <w:tc>
+          <w:tcPr>
+            <w:tcW w:type="dxa" w:w="3312"/>
+          </w:tcPr>
+          <w:p>
+            <w:pPr>
+              <w:spacing w:after="60"/>
+            </w:pPr>
+            <w:r/>
+            <w:r>
+              <w:rPr>
+                <w:rFonts w:ascii="Calibri" w:hAnsi="Calibri"/>
+                <w:sz w:val="20"/>
+              </w:rPr>
+              <w:t>P95 job processing time</w:t>
+            </w:r>
+          </w:p>
+        </w:tc>
+        <w:tc>
+          <w:tcPr>
+            <w:tcW w:type="dxa" w:w="3312"/>
+          </w:tcPr>
+          <w:p>
+            <w:pPr>
+              <w:spacing w:after="60"/>
+            </w:pPr>
+            <w:r/>
+            <w:r>
+              <w:rPr>
+                <w:rFonts w:ascii="Calibri" w:hAnsi="Calibri"/>
+                <w:sz w:val="20"/>
+              </w:rPr>
+              <w:t>116.5 s</w:t>
+            </w:r>
+          </w:p>
+        </w:tc>
+        <w:tc>
+          <w:tcPr>
+            <w:tcW w:type="dxa" w:w="2736"/>
+          </w:tcPr>
+          <w:p>
+            <w:pPr>
+              <w:spacing w:after="60"/>
+            </w:pPr>
+            <w:r/>
+            <w:r>
+              <w:rPr>
+                <w:rFonts w:ascii="Calibri" w:hAnsi="Calibri"/>
+                <w:sz w:val="20"/>
+              </w:rPr>
+              <w:t>trailing 30 days, completed jobs</w:t>
+            </w:r>
+          </w:p>
+        </w:tc>
+      </w:tr>
+      <w:tr>
+        <w:tc>
+          <w:tcPr>
+            <w:tcW w:type="dxa" w:w="3312"/>
+          </w:tcPr>
+          <w:p>
+            <w:pPr>
+              <w:spacing w:after="60"/>
+            </w:pPr>
+            <w:r/>
+            <w:r>
+              <w:rPr>
+                <w:rFonts w:ascii="Calibri" w:hAnsi="Calibri"/>
+                <w:sz w:val="20"/>
+              </w:rPr>
+              <w:t>Job failure rate</w:t>
+            </w:r>
+          </w:p>
+        </w:tc>
+        <w:tc>
+          <w:tcPr>
+            <w:tcW w:type="dxa" w:w="3312"/>
+          </w:tcPr>
+          <w:p>
+            <w:pPr>
+              <w:spacing w:after="60"/>
+            </w:pPr>
+            <w:r/>
+            <w:r>
+              <w:rPr>
+                <w:rFonts w:ascii="Calibri" w:hAnsi="Calibri"/>
+                <w:sz w:val="20"/>
+              </w:rPr>
+              <w:t>5.1%</w:t>
+            </w:r>
+          </w:p>
+        </w:tc>
+        <w:tc>
+          <w:tcPr>
+            <w:tcW w:type="dxa" w:w="2736"/>
+          </w:tcPr>
+          <w:p>
+            <w:pPr>
+              <w:spacing w:after="60"/>
+            </w:pPr>
+            <w:r/>
+            <w:r>
+              <w:rPr>
+                <w:rFonts w:ascii="Calibri" w:hAnsi="Calibri"/>
+                <w:sz w:val="20"/>
+              </w:rPr>
+              <w:t>trailing 30 days</w:t>
+            </w:r>
+          </w:p>
+        </w:tc>
+      </w:tr>
+      <w:tr>
+        <w:tc>
+          <w:tcPr>
+            <w:tcW w:type="dxa" w:w="3312"/>
+          </w:tcPr>
+          <w:p>
+            <w:pPr>
+              <w:spacing w:after="60"/>
+            </w:pPr>
+            <w:r/>
+            <w:r>
+              <w:rPr>
+                <w:rFonts w:ascii="Calibri" w:hAnsi="Calibri"/>
+                <w:sz w:val="20"/>
+              </w:rPr>
+              <w:t>Average customer rating</w:t>
+            </w:r>
+          </w:p>
+        </w:tc>
+        <w:tc>
+          <w:tcPr>
+            <w:tcW w:type="dxa" w:w="3312"/>
+          </w:tcPr>
+          <w:p>
+            <w:pPr>
+              <w:spacing w:after="60"/>
+            </w:pPr>
+            <w:r/>
+            <w:r>
+              <w:rPr>
+                <w:rFonts w:ascii="Calibri" w:hAnsi="Calibri"/>
+                <w:sz w:val="20"/>
+              </w:rPr>
+              <w:t>4.6 / 5 (38 ratings)</w:t>
+            </w:r>
+          </w:p>
+        </w:tc>
+        <w:tc>
+          <w:tcPr>
+            <w:tcW w:type="dxa" w:w="2736"/>
+          </w:tcPr>
+          <w:p>
+            <w:pPr>
+              <w:spacing w:after="60"/>
+            </w:pPr>
+            <w:r/>
+            <w:r>
+              <w:rPr>
+                <w:rFonts w:ascii="Calibri" w:hAnsi="Calibri"/>
+                <w:sz w:val="20"/>
+              </w:rPr>
+              <w:t>cumulative</w:t>
+            </w:r>
+          </w:p>
+        </w:tc>
+      </w:tr>
+      <w:tr>
+        <w:tc>
+          <w:tcPr>
+            <w:tcW w:type="dxa" w:w="3312"/>
+          </w:tcPr>
+          <w:p>
+            <w:pPr>
+              <w:spacing w:after="60"/>
+            </w:pPr>
+            <w:r/>
+            <w:r>
+              <w:rPr>
+                <w:rFonts w:ascii="Calibri" w:hAnsi="Calibri"/>
+                <w:sz w:val="20"/>
+              </w:rPr>
+              <w:t>Top tool by volume</w:t>
+            </w:r>
+          </w:p>
+        </w:tc>
+        <w:tc>
+          <w:tcPr>
+            <w:tcW w:type="dxa" w:w="3312"/>
+          </w:tcPr>
+          <w:p>
+            <w:pPr>
+              <w:spacing w:after="60"/>
+            </w:pPr>
+            <w:r/>
+            <w:r>
+              <w:rPr>
+                <w:rFonts w:ascii="Calibri" w:hAnsi="Calibri"/>
+                <w:sz w:val="20"/>
+              </w:rPr>
+              <w:t>Video → Subtitles (153 jobs)</w:t>
+            </w:r>
+          </w:p>
+        </w:tc>
+        <w:tc>
+          <w:tcPr>
+            <w:tcW w:type="dxa" w:w="2736"/>
+          </w:tcPr>
+          <w:p>
+            <w:pPr>
+              <w:spacing w:after="60"/>
+            </w:pPr>
+            <w:r/>
+            <w:r>
+              <w:rPr>
+                <w:rFonts w:ascii="Calibri" w:hAnsi="Calibri"/>
+                <w:sz w:val="20"/>
+              </w:rPr>
+              <w:t>trailing 30 days</w:t>
+            </w:r>
+          </w:p>
+        </w:tc>
+      </w:tr>
+    </w:tbl>
+    <w:p>
+      <w:pPr>
+        <w:spacing w:before="120"/>
+      </w:pPr>
+      <w:r>
+        <w:rPr>
+          <w:i/>
+          <w:sz w:val="20"/>
+        </w:rPr>
+        <w:t>These are operational and product-quality metrics (throughput, reliability, customer satisfaction, and growth), not revenue or subscriber-count figures — counsel may attach a dated screenshot of this dashboard view as a labeled exhibit, and should refresh the figures immediately before filing since they change daily.</w:t>
       </w:r>
     </w:p>
     <w:p>
@@ -2746,7 +3299,7 @@
           <w:i/>
           <w:sz w:val="20"/>
         </w:rPr>
-        <w:t>Prepared as a technical exhibit for immigration counsel; last regenerated 2026-08-08. Attach the camera-ready ICCS PDF to the petition as the primary scholarly exhibit. Add redacted revenue, customer counts, subscriber counts, and testimonials only as separate exhibits if counsel approves — this memorandum intentionally states production evidence qualitatively (measured reconciliation results, measured throughput) rather than citing point-in-time headcounts that would need continual updating and are better sourced fresh from Stripe/Postgres at filing time.</w:t>
+        <w:t>Prepared as a technical exhibit for immigration counsel; last regenerated 2026-08-08. Attach the camera-ready ICCS PDF to the petition as the primary scholarly exhibit. The operational snapshot above is current as of the regeneration date; refresh it from the live dashboard immediately before filing. Add redacted revenue and subscriber-count figures only as a separate exhibit if counsel approves — this memorandum otherwise cites operational/quality metrics (throughput, reliability, ratings, growth) rather than revenue, which is more time-sensitive and commercially sensitive.</w:t>
       </w:r>
     </w:p>
     <w:sectPr>

</xml_diff>

<commit_message>
Upgrade IndieHunt evidence to 1st-place win, add LinkedIn presence
IndieHunt claim was "featured" (weak, unverifiable); replace with the
actual dated result: 1st place / Winner in the weekly launch cohort
(8 votes, week of 2026-06-29), corroborated by IndieHunt's own winner
confirmation emails. Also add the LinkedIn company page (155 followers)
as an additional third-party recognition data point.
</commit_message>
<xml_diff>
--- a/docs/O1A/RESEARCH_TO_PRODUCT_CRITERION3_TECHNICAL_SUMMARY.docx
+++ b/docs/O1A/RESEARCH_TO_PRODUCT_CRITERION3_TECHNICAL_SUMMARY.docx
@@ -129,7 +129,7 @@
           <w:b w:val="0"/>
           <w:i w:val="0"/>
         </w:rPr>
-        <w:t>VideoText.io is featured on IndieHunt (independent product discovery).</w:t>
+        <w:t>VideoText.io won 1st place (Winner status, 8 votes) in its weekly IndieHunt launch cohort, week of 2026-06-29 — an independent, judged/voted product ranking, not merely a directory listing. IndieHunt confirmed the placement and issued a winner badge and a dofollow backlink upgrade (email confirmations dated 2026-06-29 and 2026-07-05).</w:t>
       </w:r>
     </w:p>
     <w:p>
@@ -197,6 +197,27 @@
     </w:p>
     <w:p>
       <w:pPr>
+        <w:pStyle w:val="ListBullet"/>
+      </w:pPr>
+      <w:r>
+        <w:rPr>
+          <w:rFonts w:ascii="Calibri" w:hAnsi="Calibri" w:eastAsia="Calibri"/>
+          <w:b/>
+          <w:i w:val="0"/>
+        </w:rPr>
+        <w:t xml:space="preserve">LinkedIn. </w:t>
+      </w:r>
+      <w:r>
+        <w:rPr>
+          <w:rFonts w:ascii="Calibri" w:hAnsi="Calibri" w:eastAsia="Calibri"/>
+          <w:b w:val="0"/>
+          <w:i w:val="0"/>
+        </w:rPr>
+        <w:t>VideoText.io maintains a company presence on LinkedIn with 155 followers, used for product updates and professional-audience distribution.</w:t>
+      </w:r>
+    </w:p>
+    <w:p>
+      <w:pPr>
         <w:ind w:left="360"/>
       </w:pPr>
       <w:r>
@@ -204,7 +225,7 @@
           <w:i/>
           <w:sz w:val="20"/>
         </w:rPr>
-        <w:t>Immigration packet: include direct links to each listing and/or dated PDF screenshots as labeled exhibits (e.g., Exhibit C-3a through C-3d).</w:t>
+        <w:t>Immigration packet: include direct links to each listing and/or dated PDF screenshots as labeled exhibits (e.g., Exhibit C-3a through C-3d), including the IndieHunt winner confirmation emails and the LinkedIn company page.</w:t>
       </w:r>
     </w:p>
     <w:p>
@@ -1326,7 +1347,7 @@
         <w:t xml:space="preserve">2. Significance (industry). </w:t>
       </w:r>
       <w:r>
-        <w:t>VideoText.io converts that research mindset into shipping software with subscriptions and usage metering, proving the applicant can operationalize hybrid AI systems beyond a lab benchmark — a relatively rare combination in O-1A filings that often show either publications or a product, not a coherent bridge between the two. That the applicant then independently re-applied the same governed-determinism methodology to a second, unrelated system (the analytics architecture described above) — reaching a measured zero-unexplained-discrepancy reconciliation result without being asked to — indicates a repeatable engineering judgment rather than a one-off result, and the production pipeline’s own throughput (approximately 47× realtime on long-form video, measured, not estimated) shows the discipline was applied without sacrificing commercial performance. Independent distribution and review channels reinforce field recognition: the product is featured on IndieHunt, carries a Fazier badge or listing, and is published on G2 and Capterra, which are widely used by buyers to evaluate software — evidence that the contribution sits in the commercial marketplace, not only in a private deployment.</w:t>
+        <w:t>VideoText.io converts that research mindset into shipping software with subscriptions and usage metering, proving the applicant can operationalize hybrid AI systems beyond a lab benchmark — a relatively rare combination in O-1A filings that often show either publications or a product, not a coherent bridge between the two. That the applicant then independently re-applied the same governed-determinism methodology to a second, unrelated system (the analytics architecture described above) — reaching a measured zero-unexplained-discrepancy reconciliation result without being asked to — indicates a repeatable engineering judgment rather than a one-off result, and the production pipeline’s own throughput (approximately 47× realtime on long-form video, measured, not estimated) shows the discipline was applied without sacrificing commercial performance. Independent distribution and review channels reinforce field recognition: the product placed 1st (Winner, judged and voted, 8 votes) in its IndieHunt weekly launch cohort, carries a Fazier badge or listing, is published on G2 and Capterra, and maintains a public LinkedIn company presence — evidence that the contribution sits in the commercial marketplace, not only in a private deployment.</w:t>
       </w:r>
     </w:p>
     <w:p>
@@ -1393,7 +1414,7 @@
         </w:tc>
         <w:tc>
           <w:tcPr>
-            <w:tcW w:type="dxa" w:w="3168"/>
+            <w:tcW w:type="dxa" w:w="3456"/>
             <w:shd w:fill="D9D9D9"/>
           </w:tcPr>
           <w:p>
@@ -1413,7 +1434,7 @@
         </w:tc>
         <w:tc>
           <w:tcPr>
-            <w:tcW w:type="dxa" w:w="4176"/>
+            <w:tcW w:type="dxa" w:w="3888"/>
             <w:shd w:fill="D9D9D9"/>
           </w:tcPr>
           <w:p>
@@ -1453,7 +1474,7 @@
         </w:tc>
         <w:tc>
           <w:tcPr>
-            <w:tcW w:type="dxa" w:w="3168"/>
+            <w:tcW w:type="dxa" w:w="3456"/>
           </w:tcPr>
           <w:p>
             <w:pPr>
@@ -1465,13 +1486,13 @@
                 <w:rFonts w:ascii="Calibri" w:hAnsi="Calibri"/>
                 <w:sz w:val="20"/>
               </w:rPr>
-              <w:t>Featured listing or feature placement for VideoText.io</w:t>
+              <w:t>1st place / Winner, weekly launch cohort, 8 votes, week of 2026-06-29 (judged/voted ranking, not a directory listing)</w:t>
             </w:r>
           </w:p>
         </w:tc>
         <w:tc>
           <w:tcPr>
-            <w:tcW w:type="dxa" w:w="4176"/>
+            <w:tcW w:type="dxa" w:w="3888"/>
           </w:tcPr>
           <w:p>
             <w:pPr>
@@ -1483,7 +1504,7 @@
                 <w:rFonts w:ascii="Calibri" w:hAnsi="Calibri"/>
                 <w:sz w:val="20"/>
               </w:rPr>
-              <w:t>Screenshot or permalink to the IndieHunt feature page</w:t>
+              <w:t>IndieHunt winner confirmation emails (dated 2026-06-29, 2026-07-05) plus permalink/screenshot of the result page</w:t>
             </w:r>
           </w:p>
         </w:tc>
@@ -1509,7 +1530,7 @@
         </w:tc>
         <w:tc>
           <w:tcPr>
-            <w:tcW w:type="dxa" w:w="3168"/>
+            <w:tcW w:type="dxa" w:w="3456"/>
           </w:tcPr>
           <w:p>
             <w:pPr>
@@ -1527,7 +1548,7 @@
         </w:tc>
         <w:tc>
           <w:tcPr>
-            <w:tcW w:type="dxa" w:w="4176"/>
+            <w:tcW w:type="dxa" w:w="3888"/>
           </w:tcPr>
           <w:p>
             <w:pPr>
@@ -1565,7 +1586,7 @@
         </w:tc>
         <w:tc>
           <w:tcPr>
-            <w:tcW w:type="dxa" w:w="3168"/>
+            <w:tcW w:type="dxa" w:w="3456"/>
           </w:tcPr>
           <w:p>
             <w:pPr>
@@ -1583,7 +1604,7 @@
         </w:tc>
         <w:tc>
           <w:tcPr>
-            <w:tcW w:type="dxa" w:w="4176"/>
+            <w:tcW w:type="dxa" w:w="3888"/>
           </w:tcPr>
           <w:p>
             <w:pPr>
@@ -1621,7 +1642,7 @@
         </w:tc>
         <w:tc>
           <w:tcPr>
-            <w:tcW w:type="dxa" w:w="3168"/>
+            <w:tcW w:type="dxa" w:w="3456"/>
           </w:tcPr>
           <w:p>
             <w:pPr>
@@ -1639,7 +1660,7 @@
         </w:tc>
         <w:tc>
           <w:tcPr>
-            <w:tcW w:type="dxa" w:w="4176"/>
+            <w:tcW w:type="dxa" w:w="3888"/>
           </w:tcPr>
           <w:p>
             <w:pPr>
@@ -1652,6 +1673,62 @@
                 <w:sz w:val="20"/>
               </w:rPr>
               <w:t>Capterra product page URL plus dated screenshot</w:t>
+            </w:r>
+          </w:p>
+        </w:tc>
+      </w:tr>
+      <w:tr>
+        <w:tc>
+          <w:tcPr>
+            <w:tcW w:type="dxa" w:w="1584"/>
+          </w:tcPr>
+          <w:p>
+            <w:pPr>
+              <w:spacing w:after="60"/>
+            </w:pPr>
+            <w:r/>
+            <w:r>
+              <w:rPr>
+                <w:rFonts w:ascii="Calibri" w:hAnsi="Calibri"/>
+                <w:sz w:val="20"/>
+              </w:rPr>
+              <w:t>LinkedIn</w:t>
+            </w:r>
+          </w:p>
+        </w:tc>
+        <w:tc>
+          <w:tcPr>
+            <w:tcW w:type="dxa" w:w="3456"/>
+          </w:tcPr>
+          <w:p>
+            <w:pPr>
+              <w:spacing w:after="60"/>
+            </w:pPr>
+            <w:r/>
+            <w:r>
+              <w:rPr>
+                <w:rFonts w:ascii="Calibri" w:hAnsi="Calibri"/>
+                <w:sz w:val="20"/>
+              </w:rPr>
+              <w:t>Company page, 155 followers</w:t>
+            </w:r>
+          </w:p>
+        </w:tc>
+        <w:tc>
+          <w:tcPr>
+            <w:tcW w:type="dxa" w:w="3888"/>
+          </w:tcPr>
+          <w:p>
+            <w:pPr>
+              <w:spacing w:after="60"/>
+            </w:pPr>
+            <w:r/>
+            <w:r>
+              <w:rPr>
+                <w:rFonts w:ascii="Calibri" w:hAnsi="Calibri"/>
+                <w:sz w:val="20"/>
+              </w:rPr>
+              <w:t>LinkedIn company page URL plus dated screenshot</w:t>
             </w:r>
           </w:p>
         </w:tc>

</xml_diff>